<commit_message>
Warranty policy draft v2: rewritten in own words after comparing AU retailers
Co-Authored-By: Claude Sonnet 5.5 <noreply@anthropic.com>
</commit_message>
<xml_diff>
--- a/docs/policy-drafts/warranty-policy.docx
+++ b/docs/policy-drafts/warranty-policy.docx
@@ -35,7 +35,7 @@
           <w:sz w:val="20"/>
           <w:szCs w:val="20"/>
         </w:rPr>
-        <w:t xml:space="preserve">Draft for review.</w:t>
+        <w:t xml:space="preserve">Draft for review (version 2).</w:t>
       </w:r>
       <w:r>
         <w:rPr>
@@ -43,7 +43,7 @@
           <w:sz w:val="20"/>
           <w:szCs w:val="20"/>
         </w:rPr>
-        <w:t xml:space="preserve"> Written from the details already on the Super Shelving site (FAQs page). Anything in </w:t>
+        <w:t xml:space="preserve"> Rewritten in our own words after comparing five Australian shelving retailers' warranty pages. Anything in </w:t>
       </w:r>
       <w:r>
         <w:rPr>
@@ -62,7 +62,7 @@
           <w:sz w:val="20"/>
           <w:szCs w:val="20"/>
         </w:rPr>
-        <w:t xml:space="preserve"> is a placeholder or an assumption to confirm. Not legal advice - have it checked before publishing, especially the Australian Consumer Law statement in section 1.</w:t>
+        <w:t xml:space="preserve"> is a placeholder or an assumption to confirm. Not legal advice - have it checked before publishing, especially sections 1, 2 and 11.</w:t>
       </w:r>
     </w:p>
     <w:p>
@@ -81,14 +81,7 @@
         <w:rPr>
           <w:rFonts w:ascii="Arial" w:cs="Arial" w:eastAsia="Arial" w:hAnsi="Arial"/>
         </w:rPr>
-        <w:t xml:space="preserve"> </w:t>
-      </w:r>
-      <w:r>
-        <w:rPr>
-          <w:rFonts w:ascii="Arial" w:cs="Arial" w:eastAsia="Arial" w:hAnsi="Arial"/>
-          <w:shd w:fill="FFF2B3" w:color="auto" w:val="clear"/>
-        </w:rPr>
-        <w:t xml:space="preserve">[DATE]</w:t>
+        <w:t xml:space="preserve"> 14 October 2026</w:t>
       </w:r>
     </w:p>
     <w:p>
@@ -203,21 +196,6 @@
           <w:rFonts w:ascii="Arial" w:cs="Arial" w:eastAsia="Arial" w:hAnsi="Arial"/>
           <w:b/>
           <w:bCs/>
-          <w:shd w:fill="FFF2B3" w:color="auto" w:val="clear"/>
-        </w:rPr>
-        <w:t xml:space="preserve">[LEGAL BUSINESS NAME]</w:t>
-      </w:r>
-      <w:r>
-        <w:rPr>
-          <w:rFonts w:ascii="Arial" w:cs="Arial" w:eastAsia="Arial" w:hAnsi="Arial"/>
-        </w:rPr>
-        <w:t xml:space="preserve"> trading as </w:t>
-      </w:r>
-      <w:r>
-        <w:rPr>
-          <w:rFonts w:ascii="Arial" w:cs="Arial" w:eastAsia="Arial" w:hAnsi="Arial"/>
-          <w:b/>
-          <w:bCs/>
         </w:rPr>
         <w:t xml:space="preserve">Super Shelving</w:t>
       </w:r>
@@ -225,20 +203,7 @@
         <w:rPr>
           <w:rFonts w:ascii="Arial" w:cs="Arial" w:eastAsia="Arial" w:hAnsi="Arial"/>
         </w:rPr>
-        <w:t xml:space="preserve"> (ABN </w:t>
-      </w:r>
-      <w:r>
-        <w:rPr>
-          <w:rFonts w:ascii="Arial" w:cs="Arial" w:eastAsia="Arial" w:hAnsi="Arial"/>
-          <w:shd w:fill="FFF2B3" w:color="auto" w:val="clear"/>
-        </w:rPr>
-        <w:t xml:space="preserve">[ABN]</w:t>
-      </w:r>
-      <w:r>
-        <w:rPr>
-          <w:rFonts w:ascii="Arial" w:cs="Arial" w:eastAsia="Arial" w:hAnsi="Arial"/>
-        </w:rPr>
-        <w:t xml:space="preserve">)</w:t>
+        <w:t xml:space="preserve"> (ABN 35 812 490 397)</w:t>
       </w:r>
       <w:r>
         <w:rPr>
@@ -274,14 +239,7 @@
         <w:rPr>
           <w:rFonts w:ascii="Arial" w:cs="Arial" w:eastAsia="Arial" w:hAnsi="Arial"/>
         </w:rPr>
-        <w:t xml:space="preserve">Email: </w:t>
-      </w:r>
-      <w:r>
-        <w:rPr>
-          <w:rFonts w:ascii="Arial" w:cs="Arial" w:eastAsia="Arial" w:hAnsi="Arial"/>
-          <w:shd w:fill="FFF2B3" w:color="auto" w:val="clear"/>
-        </w:rPr>
-        <w:t xml:space="preserve">[BUSINESS EMAIL]</w:t>
+        <w:t xml:space="preserve">Email: Edwin_10@live.com.au</w:t>
       </w:r>
     </w:p>
     <w:p>
@@ -309,21 +267,50 @@
         <w:rPr>
           <w:rFonts w:ascii="Arial" w:cs="Arial" w:eastAsia="Arial" w:hAnsi="Arial"/>
         </w:rPr>
-        <w:t xml:space="preserve">All Super Shelving products come with a </w:t>
-      </w:r>
-      <w:r>
-        <w:rPr>
-          <w:rFonts w:ascii="Arial" w:cs="Arial" w:eastAsia="Arial" w:hAnsi="Arial"/>
-          <w:b/>
-          <w:bCs/>
-        </w:rPr>
-        <w:t xml:space="preserve">12-month warranty</w:t>
-      </w:r>
-      <w:r>
-        <w:rPr>
-          <w:rFonts w:ascii="Arial" w:cs="Arial" w:eastAsia="Arial" w:hAnsi="Arial"/>
-        </w:rPr>
-        <w:t xml:space="preserve"> from the date of purchase. This is in addition to the consumer guarantees described in section 1.</w:t>
+        <w:t xml:space="preserve">Every Super Shelving product is covered for </w:t>
+      </w:r>
+      <w:r>
+        <w:rPr>
+          <w:rFonts w:ascii="Arial" w:cs="Arial" w:eastAsia="Arial" w:hAnsi="Arial"/>
+          <w:b/>
+          <w:bCs/>
+        </w:rPr>
+        <w:t xml:space="preserve">12 months</w:t>
+      </w:r>
+      <w:r>
+        <w:rPr>
+          <w:rFonts w:ascii="Arial" w:cs="Arial" w:eastAsia="Arial" w:hAnsi="Arial"/>
+        </w:rPr>
+        <w:t xml:space="preserve"> from the </w:t>
+      </w:r>
+      <w:r>
+        <w:rPr>
+          <w:rFonts w:ascii="Arial" w:cs="Arial" w:eastAsia="Arial" w:hAnsi="Arial"/>
+          <w:b/>
+          <w:bCs/>
+        </w:rPr>
+        <w:t xml:space="preserve">date of purchase</w:t>
+      </w:r>
+      <w:r>
+        <w:rPr>
+          <w:rFonts w:ascii="Arial" w:cs="Arial" w:eastAsia="Arial" w:hAnsi="Arial"/>
+        </w:rPr>
+        <w:t xml:space="preserve"> </w:t>
+      </w:r>
+      <w:r>
+        <w:rPr>
+          <w:rFonts w:ascii="Arial" w:cs="Arial" w:eastAsia="Arial" w:hAnsi="Arial"/>
+          <w:b/>
+          <w:bCs/>
+          <w:shd w:fill="FFF2B3" w:color="auto" w:val="clear"/>
+        </w:rPr>
+        <w:t xml:space="preserve">[CONFIRM: or from the date you receive or collect the order]</w:t>
+      </w:r>
+      <w:r>
+        <w:rPr>
+          <w:rFonts w:ascii="Arial" w:cs="Arial" w:eastAsia="Arial" w:hAnsi="Arial"/>
+        </w:rPr>
+        <w:t xml:space="preserve">. This is on top of the consumer guarantees described in section 1, which are not limited to 12 months.</w:t>
       </w:r>
     </w:p>
     <w:p>
@@ -340,7 +327,7 @@
           <w:sz w:val="26"/>
           <w:szCs w:val="26"/>
         </w:rPr>
-        <w:t xml:space="preserve">4. What the warranty covers</w:t>
+        <w:t xml:space="preserve">4. What we will do</w:t>
       </w:r>
     </w:p>
     <w:p>
@@ -351,7 +338,7 @@
         <w:rPr>
           <w:rFonts w:ascii="Arial" w:cs="Arial" w:eastAsia="Arial" w:hAnsi="Arial"/>
         </w:rPr>
-        <w:t xml:space="preserve">If a product has a defect in materials or workmanship when used normally and as intended, we will repair or replace the product or the defective part at no cost to you. This includes:</w:t>
+        <w:t xml:space="preserve">If a product has a covered defect, we will, at no cost to you:</w:t>
       </w:r>
     </w:p>
     <w:p>
@@ -369,13 +356,13 @@
           <w:b/>
           <w:bCs/>
         </w:rPr>
-        <w:t xml:space="preserve">Manufacturing defects</w:t>
-      </w:r>
-      <w:r>
-        <w:rPr>
-          <w:rFonts w:ascii="Arial" w:cs="Arial" w:eastAsia="Arial" w:hAnsi="Arial"/>
-        </w:rPr>
-        <w:t xml:space="preserve"> - faults in materials or workmanship.</w:t>
+        <w:t xml:space="preserve">repair</w:t>
+      </w:r>
+      <w:r>
+        <w:rPr>
+          <w:rFonts w:ascii="Arial" w:cs="Arial" w:eastAsia="Arial" w:hAnsi="Arial"/>
+        </w:rPr>
+        <w:t xml:space="preserve"> it, or</w:t>
       </w:r>
     </w:p>
     <w:p>
@@ -393,13 +380,13 @@
           <w:b/>
           <w:bCs/>
         </w:rPr>
-        <w:t xml:space="preserve">Structural integrity</w:t>
-      </w:r>
-      <w:r>
-        <w:rPr>
-          <w:rFonts w:ascii="Arial" w:cs="Arial" w:eastAsia="Arial" w:hAnsi="Arial"/>
-        </w:rPr>
-        <w:t xml:space="preserve"> - problems affecting how shelves, beams, uprights and workbench frames perform when loaded within the recommended limits.</w:t>
+        <w:t xml:space="preserve">replace</w:t>
+      </w:r>
+      <w:r>
+        <w:rPr>
+          <w:rFonts w:ascii="Arial" w:cs="Arial" w:eastAsia="Arial" w:hAnsi="Arial"/>
+        </w:rPr>
+        <w:t xml:space="preserve"> the faulty part or the whole product, or</w:t>
       </w:r>
     </w:p>
     <w:p>
@@ -414,16 +401,59 @@
       <w:r>
         <w:rPr>
           <w:rFonts w:ascii="Arial" w:cs="Arial" w:eastAsia="Arial" w:hAnsi="Arial"/>
-          <w:b/>
-          <w:bCs/>
-        </w:rPr>
-        <w:t xml:space="preserve">Parts replacement</w:t>
-      </w:r>
-      <w:r>
-        <w:rPr>
-          <w:rFonts w:ascii="Arial" w:cs="Arial" w:eastAsia="Arial" w:hAnsi="Arial"/>
-        </w:rPr>
-        <w:t xml:space="preserve"> - repair or replacement of defective components.</w:t>
+        </w:rPr>
+        <w:t xml:space="preserve">if the same product is no longer available, replace it with one of </w:t>
+      </w:r>
+      <w:r>
+        <w:rPr>
+          <w:rFonts w:ascii="Arial" w:cs="Arial" w:eastAsia="Arial" w:hAnsi="Arial"/>
+          <w:b/>
+          <w:bCs/>
+        </w:rPr>
+        <w:t xml:space="preserve">equal or better specification</w:t>
+      </w:r>
+      <w:r>
+        <w:rPr>
+          <w:rFonts w:ascii="Arial" w:cs="Arial" w:eastAsia="Arial" w:hAnsi="Arial"/>
+        </w:rPr>
+        <w:t xml:space="preserve">.</w:t>
+      </w:r>
+    </w:p>
+    <w:p>
+      <w:pPr>
+        <w:spacing w:after="160" w:line="300"/>
+      </w:pPr>
+      <w:r>
+        <w:rPr>
+          <w:rFonts w:ascii="Arial" w:cs="Arial" w:eastAsia="Arial" w:hAnsi="Arial"/>
+        </w:rPr>
+        <w:t xml:space="preserve">Where the law gives you a right to a refund, we will honour it.</w:t>
+      </w:r>
+    </w:p>
+    <w:p>
+      <w:pPr>
+        <w:spacing w:after="160" w:line="300"/>
+      </w:pPr>
+      <w:r>
+        <w:rPr>
+          <w:rFonts w:ascii="Arial" w:cs="Arial" w:eastAsia="Arial" w:hAnsi="Arial"/>
+        </w:rPr>
+        <w:t xml:space="preserve">If we replace a product or part, the replacement is covered for the rest of the original 12-month period </w:t>
+      </w:r>
+      <w:r>
+        <w:rPr>
+          <w:rFonts w:ascii="Arial" w:cs="Arial" w:eastAsia="Arial" w:hAnsi="Arial"/>
+          <w:b/>
+          <w:bCs/>
+          <w:shd w:fill="FFF2B3" w:color="auto" w:val="clear"/>
+        </w:rPr>
+        <w:t xml:space="preserve">[CONFIRM: or choose a fresh period]</w:t>
+      </w:r>
+      <w:r>
+        <w:rPr>
+          <w:rFonts w:ascii="Arial" w:cs="Arial" w:eastAsia="Arial" w:hAnsi="Arial"/>
+        </w:rPr>
+        <w:t xml:space="preserve">.</w:t>
       </w:r>
     </w:p>
     <w:p>
@@ -440,7 +470,7 @@
           <w:sz w:val="26"/>
           <w:szCs w:val="26"/>
         </w:rPr>
-        <w:t xml:space="preserve">5. What the warranty does not cover</w:t>
+        <w:t xml:space="preserve">5. What is covered</w:t>
       </w:r>
     </w:p>
     <w:p>
@@ -451,7 +481,7 @@
         <w:rPr>
           <w:rFonts w:ascii="Arial" w:cs="Arial" w:eastAsia="Arial" w:hAnsi="Arial"/>
         </w:rPr>
-        <w:t xml:space="preserve">This warranty does not cover:</w:t>
+        <w:t xml:space="preserve">We cover faults that are caused by how the product was made, when it is assembled as instructed and used within its stated load ratings. This includes:</w:t>
       </w:r>
     </w:p>
     <w:p>
@@ -467,7 +497,21 @@
         <w:rPr>
           <w:rFonts w:ascii="Arial" w:cs="Arial" w:eastAsia="Arial" w:hAnsi="Arial"/>
         </w:rPr>
-        <w:t xml:space="preserve">damage caused by misuse, incorrect assembly or overloading beyond the stated load ratings</w:t>
+        <w:t xml:space="preserve">defects in the </w:t>
+      </w:r>
+      <w:r>
+        <w:rPr>
+          <w:rFonts w:ascii="Arial" w:cs="Arial" w:eastAsia="Arial" w:hAnsi="Arial"/>
+          <w:b/>
+          <w:bCs/>
+        </w:rPr>
+        <w:t xml:space="preserve">materials or workmanship</w:t>
+      </w:r>
+      <w:r>
+        <w:rPr>
+          <w:rFonts w:ascii="Arial" w:cs="Arial" w:eastAsia="Arial" w:hAnsi="Arial"/>
+        </w:rPr>
+        <w:t xml:space="preserve"> of frames, uprights, beams, shelves or workbench tops</w:t>
       </w:r>
     </w:p>
     <w:p>
@@ -482,8 +526,16 @@
       <w:r>
         <w:rPr>
           <w:rFonts w:ascii="Arial" w:cs="Arial" w:eastAsia="Arial" w:hAnsi="Arial"/>
-        </w:rPr>
-        <w:t xml:space="preserve">general wear and tear, scratches or cosmetic marks</w:t>
+          <w:b/>
+          <w:bCs/>
+        </w:rPr>
+        <w:t xml:space="preserve">structural problems</w:t>
+      </w:r>
+      <w:r>
+        <w:rPr>
+          <w:rFonts w:ascii="Arial" w:cs="Arial" w:eastAsia="Arial" w:hAnsi="Arial"/>
+        </w:rPr>
+        <w:t xml:space="preserve"> where the product fails under a load that is within its rating</w:t>
       </w:r>
     </w:p>
     <w:p>
@@ -498,76 +550,16 @@
       <w:r>
         <w:rPr>
           <w:rFonts w:ascii="Arial" w:cs="Arial" w:eastAsia="Arial" w:hAnsi="Arial"/>
-        </w:rPr>
-        <w:t xml:space="preserve">modifications, or repairs carried out by anyone not authorised by us</w:t>
-      </w:r>
-    </w:p>
-    <w:p>
-      <w:pPr>
-        <w:pStyle w:val="ListParagraph"/>
-        <w:numPr>
-          <w:ilvl w:val="0"/>
-          <w:numId w:val="2"/>
-        </w:numPr>
-        <w:spacing w:after="100" w:line="300"/>
-      </w:pPr>
-      <w:r>
-        <w:rPr>
-          <w:rFonts w:ascii="Arial" w:cs="Arial" w:eastAsia="Arial" w:hAnsi="Arial"/>
-        </w:rPr>
-        <w:t xml:space="preserve">moisture, rust or corrosion caused by improper storage or use (for example, use outdoors or in constantly damp conditions) </w:t>
-      </w:r>
-      <w:r>
-        <w:rPr>
-          <w:rFonts w:ascii="Arial" w:cs="Arial" w:eastAsia="Arial" w:hAnsi="Arial"/>
-          <w:b/>
-          <w:bCs/>
-          <w:shd w:fill="FFF2B3" w:color="auto" w:val="clear"/>
-        </w:rPr>
-        <w:t xml:space="preserve">[CONFIRM: are any products rated for outdoor use?]</w:t>
-      </w:r>
-    </w:p>
-    <w:p>
-      <w:pPr>
-        <w:pStyle w:val="ListParagraph"/>
-        <w:numPr>
-          <w:ilvl w:val="0"/>
-          <w:numId w:val="2"/>
-        </w:numPr>
-        <w:spacing w:after="100" w:line="300"/>
-      </w:pPr>
-      <w:r>
-        <w:rPr>
-          <w:rFonts w:ascii="Arial" w:cs="Arial" w:eastAsia="Arial" w:hAnsi="Arial"/>
-        </w:rPr>
-        <w:t xml:space="preserve">damage caused after delivery or collection, such as dents from dropping or moving the product</w:t>
-      </w:r>
-    </w:p>
-    <w:p>
-      <w:pPr>
-        <w:pStyle w:val="ListParagraph"/>
-        <w:numPr>
-          <w:ilvl w:val="0"/>
-          <w:numId w:val="2"/>
-        </w:numPr>
-        <w:spacing w:after="100" w:line="300"/>
-      </w:pPr>
-      <w:r>
-        <w:rPr>
-          <w:rFonts w:ascii="Arial" w:cs="Arial" w:eastAsia="Arial" w:hAnsi="Arial"/>
-        </w:rPr>
-        <w:t xml:space="preserve">products used for a purpose they were not designed for, such as holding people or being used as scaffolding</w:t>
-      </w:r>
-    </w:p>
-    <w:p>
-      <w:pPr>
-        <w:spacing w:after="160" w:line="300"/>
-      </w:pPr>
-      <w:r>
-        <w:rPr>
-          <w:rFonts w:ascii="Arial" w:cs="Arial" w:eastAsia="Arial" w:hAnsi="Arial"/>
-        </w:rPr>
-        <w:t xml:space="preserve">Nothing in this section limits your rights under the Australian Consumer Law.</w:t>
+          <w:b/>
+          <w:bCs/>
+        </w:rPr>
+        <w:t xml:space="preserve">faulty fittings or components</w:t>
+      </w:r>
+      <w:r>
+        <w:rPr>
+          <w:rFonts w:ascii="Arial" w:cs="Arial" w:eastAsia="Arial" w:hAnsi="Arial"/>
+        </w:rPr>
+        <w:t xml:space="preserve"> supplied with the product</w:t>
       </w:r>
     </w:p>
     <w:p>
@@ -584,7 +576,18 @@
           <w:sz w:val="26"/>
           <w:szCs w:val="26"/>
         </w:rPr>
-        <w:t xml:space="preserve">6. How to make a claim</w:t>
+        <w:t xml:space="preserve">6. What is not covered</w:t>
+      </w:r>
+    </w:p>
+    <w:p>
+      <w:pPr>
+        <w:spacing w:after="160" w:line="300"/>
+      </w:pPr>
+      <w:r>
+        <w:rPr>
+          <w:rFonts w:ascii="Arial" w:cs="Arial" w:eastAsia="Arial" w:hAnsi="Arial"/>
+        </w:rPr>
+        <w:t xml:space="preserve">This warranty does not cover:</w:t>
       </w:r>
     </w:p>
     <w:p>
@@ -592,36 +595,140 @@
         <w:pStyle w:val="ListParagraph"/>
         <w:numPr>
           <w:ilvl w:val="0"/>
-          <w:numId w:val="3"/>
+          <w:numId w:val="2"/>
         </w:numPr>
         <w:spacing w:after="100" w:line="300"/>
       </w:pPr>
       <w:r>
         <w:rPr>
           <w:rFonts w:ascii="Arial" w:cs="Arial" w:eastAsia="Arial" w:hAnsi="Arial"/>
-          <w:b/>
-          <w:bCs/>
-        </w:rPr>
-        <w:t xml:space="preserve">Contact us</w:t>
-      </w:r>
-      <w:r>
-        <w:rPr>
-          <w:rFonts w:ascii="Arial" w:cs="Arial" w:eastAsia="Arial" w:hAnsi="Arial"/>
-        </w:rPr>
-        <w:t xml:space="preserve"> by email at </w:t>
-      </w:r>
-      <w:r>
-        <w:rPr>
-          <w:rFonts w:ascii="Arial" w:cs="Arial" w:eastAsia="Arial" w:hAnsi="Arial"/>
+        </w:rPr>
+        <w:t xml:space="preserve">damage from </w:t>
+      </w:r>
+      <w:r>
+        <w:rPr>
+          <w:rFonts w:ascii="Arial" w:cs="Arial" w:eastAsia="Arial" w:hAnsi="Arial"/>
+          <w:b/>
+          <w:bCs/>
+        </w:rPr>
+        <w:t xml:space="preserve">overloading</w:t>
+      </w:r>
+      <w:r>
+        <w:rPr>
+          <w:rFonts w:ascii="Arial" w:cs="Arial" w:eastAsia="Arial" w:hAnsi="Arial"/>
+        </w:rPr>
+        <w:t xml:space="preserve">, uneven loading, or using a product beyond its stated load rating</w:t>
+      </w:r>
+    </w:p>
+    <w:p>
+      <w:pPr>
+        <w:pStyle w:val="ListParagraph"/>
+        <w:numPr>
+          <w:ilvl w:val="0"/>
+          <w:numId w:val="2"/>
+        </w:numPr>
+        <w:spacing w:after="100" w:line="300"/>
+      </w:pPr>
+      <w:r>
+        <w:rPr>
+          <w:rFonts w:ascii="Arial" w:cs="Arial" w:eastAsia="Arial" w:hAnsi="Arial"/>
+        </w:rPr>
+        <w:t xml:space="preserve">problems caused by </w:t>
+      </w:r>
+      <w:r>
+        <w:rPr>
+          <w:rFonts w:ascii="Arial" w:cs="Arial" w:eastAsia="Arial" w:hAnsi="Arial"/>
+          <w:b/>
+          <w:bCs/>
+        </w:rPr>
+        <w:t xml:space="preserve">incorrect assembly</w:t>
+      </w:r>
+      <w:r>
+        <w:rPr>
+          <w:rFonts w:ascii="Arial" w:cs="Arial" w:eastAsia="Arial" w:hAnsi="Arial"/>
+        </w:rPr>
+        <w:t xml:space="preserve">, or by not using all the supplied fittings</w:t>
+      </w:r>
+    </w:p>
+    <w:p>
+      <w:pPr>
+        <w:pStyle w:val="ListParagraph"/>
+        <w:numPr>
+          <w:ilvl w:val="0"/>
+          <w:numId w:val="2"/>
+        </w:numPr>
+        <w:spacing w:after="100" w:line="300"/>
+      </w:pPr>
+      <w:r>
+        <w:rPr>
+          <w:rFonts w:ascii="Arial" w:cs="Arial" w:eastAsia="Arial" w:hAnsi="Arial"/>
+          <w:b/>
+          <w:bCs/>
+        </w:rPr>
+        <w:t xml:space="preserve">modifications</w:t>
+      </w:r>
+      <w:r>
+        <w:rPr>
+          <w:rFonts w:ascii="Arial" w:cs="Arial" w:eastAsia="Arial" w:hAnsi="Arial"/>
+        </w:rPr>
+        <w:t xml:space="preserve">, or repairs and alterations carried out by anyone we have not authorised</w:t>
+      </w:r>
+    </w:p>
+    <w:p>
+      <w:pPr>
+        <w:pStyle w:val="ListParagraph"/>
+        <w:numPr>
+          <w:ilvl w:val="0"/>
+          <w:numId w:val="2"/>
+        </w:numPr>
+        <w:spacing w:after="100" w:line="300"/>
+      </w:pPr>
+      <w:r>
+        <w:rPr>
+          <w:rFonts w:ascii="Arial" w:cs="Arial" w:eastAsia="Arial" w:hAnsi="Arial"/>
+          <w:b/>
+          <w:bCs/>
+        </w:rPr>
+        <w:t xml:space="preserve">normal wear and tear</w:t>
+      </w:r>
+      <w:r>
+        <w:rPr>
+          <w:rFonts w:ascii="Arial" w:cs="Arial" w:eastAsia="Arial" w:hAnsi="Arial"/>
+        </w:rPr>
+        <w:t xml:space="preserve">, scratches, dents, scuffs or cosmetic marks that do not affect how the product works</w:t>
+      </w:r>
+    </w:p>
+    <w:p>
+      <w:pPr>
+        <w:pStyle w:val="ListParagraph"/>
+        <w:numPr>
+          <w:ilvl w:val="0"/>
+          <w:numId w:val="2"/>
+        </w:numPr>
+        <w:spacing w:after="100" w:line="300"/>
+      </w:pPr>
+      <w:r>
+        <w:rPr>
+          <w:rFonts w:ascii="Arial" w:cs="Arial" w:eastAsia="Arial" w:hAnsi="Arial"/>
+          <w:b/>
+          <w:bCs/>
+        </w:rPr>
+        <w:t xml:space="preserve">surface rust</w:t>
+      </w:r>
+      <w:r>
+        <w:rPr>
+          <w:rFonts w:ascii="Arial" w:cs="Arial" w:eastAsia="Arial" w:hAnsi="Arial"/>
+        </w:rPr>
+        <w:t xml:space="preserve"> or marks from damp, humid, salty or otherwise corrosive conditions </w:t>
+      </w:r>
+      <w:r>
+        <w:rPr>
+          <w:rFonts w:ascii="Arial" w:cs="Arial" w:eastAsia="Arial" w:hAnsi="Arial"/>
+          <w:b/>
+          <w:bCs/>
           <w:shd w:fill="FFF2B3" w:color="auto" w:val="clear"/>
         </w:rPr>
-        <w:t xml:space="preserve">[BUSINESS EMAIL]</w:t>
-      </w:r>
-      <w:r>
-        <w:rPr>
-          <w:rFonts w:ascii="Arial" w:cs="Arial" w:eastAsia="Arial" w:hAnsi="Arial"/>
-        </w:rPr>
-        <w:t xml:space="preserve"> or on +61 431 533 520, or send a message through our Contact Us page.</w:t>
+        <w:t xml:space="preserve">[CONFIRM: and whether structural rust that makes the product unsafe is still covered unless caused by neglect]</w:t>
       </w:r>
     </w:p>
     <w:p>
@@ -629,23 +736,29 @@
         <w:pStyle w:val="ListParagraph"/>
         <w:numPr>
           <w:ilvl w:val="0"/>
-          <w:numId w:val="3"/>
+          <w:numId w:val="2"/>
         </w:numPr>
         <w:spacing w:after="100" w:line="300"/>
       </w:pPr>
       <w:r>
         <w:rPr>
           <w:rFonts w:ascii="Arial" w:cs="Arial" w:eastAsia="Arial" w:hAnsi="Arial"/>
-          <w:b/>
-          <w:bCs/>
-        </w:rPr>
-        <w:t xml:space="preserve">Provide proof of purchase</w:t>
-      </w:r>
-      <w:r>
-        <w:rPr>
-          <w:rFonts w:ascii="Arial" w:cs="Arial" w:eastAsia="Arial" w:hAnsi="Arial"/>
-        </w:rPr>
-        <w:t xml:space="preserve"> (your order confirmation, invoice or receipt) and a description of the problem. Photos or a short video of the issue help us assess it quickly.</w:t>
+        </w:rPr>
+        <w:t xml:space="preserve">damage that happens </w:t>
+      </w:r>
+      <w:r>
+        <w:rPr>
+          <w:rFonts w:ascii="Arial" w:cs="Arial" w:eastAsia="Arial" w:hAnsi="Arial"/>
+          <w:b/>
+          <w:bCs/>
+        </w:rPr>
+        <w:t xml:space="preserve">after delivery or collection</w:t>
+      </w:r>
+      <w:r>
+        <w:rPr>
+          <w:rFonts w:ascii="Arial" w:cs="Arial" w:eastAsia="Arial" w:hAnsi="Arial"/>
+        </w:rPr>
+        <w:t xml:space="preserve">, for example from dropping a unit, dragging it, or moving it while loaded</w:t>
       </w:r>
     </w:p>
     <w:p>
@@ -653,46 +766,29 @@
         <w:pStyle w:val="ListParagraph"/>
         <w:numPr>
           <w:ilvl w:val="0"/>
-          <w:numId w:val="3"/>
+          <w:numId w:val="2"/>
         </w:numPr>
         <w:spacing w:after="100" w:line="300"/>
       </w:pPr>
       <w:r>
         <w:rPr>
           <w:rFonts w:ascii="Arial" w:cs="Arial" w:eastAsia="Arial" w:hAnsi="Arial"/>
-          <w:b/>
-          <w:bCs/>
-        </w:rPr>
-        <w:t xml:space="preserve">We will assess your claim</w:t>
-      </w:r>
-      <w:r>
-        <w:rPr>
-          <w:rFonts w:ascii="Arial" w:cs="Arial" w:eastAsia="Arial" w:hAnsi="Arial"/>
-        </w:rPr>
-        <w:t xml:space="preserve"> and let you know whether it is covered. We aim to respond within </w:t>
-      </w:r>
-      <w:r>
-        <w:rPr>
-          <w:rFonts w:ascii="Arial" w:cs="Arial" w:eastAsia="Arial" w:hAnsi="Arial"/>
-          <w:b/>
-          <w:bCs/>
-          <w:shd w:fill="FFF2B3" w:color="auto" w:val="clear"/>
-        </w:rPr>
-        <w:t xml:space="preserve">[X]</w:t>
-      </w:r>
-      <w:r>
-        <w:rPr>
-          <w:rFonts w:ascii="Arial" w:cs="Arial" w:eastAsia="Arial" w:hAnsi="Arial"/>
-          <w:b/>
-          <w:bCs/>
-        </w:rPr>
-        <w:t xml:space="preserve"> business days</w:t>
-      </w:r>
-      <w:r>
-        <w:rPr>
-          <w:rFonts w:ascii="Arial" w:cs="Arial" w:eastAsia="Arial" w:hAnsi="Arial"/>
-        </w:rPr>
-        <w:t xml:space="preserve">.</w:t>
+        </w:rPr>
+        <w:t xml:space="preserve">using the product for a purpose it was </w:t>
+      </w:r>
+      <w:r>
+        <w:rPr>
+          <w:rFonts w:ascii="Arial" w:cs="Arial" w:eastAsia="Arial" w:hAnsi="Arial"/>
+          <w:b/>
+          <w:bCs/>
+        </w:rPr>
+        <w:t xml:space="preserve">not designed for</w:t>
+      </w:r>
+      <w:r>
+        <w:rPr>
+          <w:rFonts w:ascii="Arial" w:cs="Arial" w:eastAsia="Arial" w:hAnsi="Arial"/>
+        </w:rPr>
+        <w:t xml:space="preserve">, such as holding or supporting people</w:t>
       </w:r>
     </w:p>
     <w:p>
@@ -700,23 +796,34 @@
         <w:pStyle w:val="ListParagraph"/>
         <w:numPr>
           <w:ilvl w:val="0"/>
-          <w:numId w:val="3"/>
+          <w:numId w:val="2"/>
         </w:numPr>
         <w:spacing w:after="100" w:line="300"/>
       </w:pPr>
       <w:r>
         <w:rPr>
           <w:rFonts w:ascii="Arial" w:cs="Arial" w:eastAsia="Arial" w:hAnsi="Arial"/>
-          <w:b/>
-          <w:bCs/>
-        </w:rPr>
-        <w:t xml:space="preserve">If approved</w:t>
-      </w:r>
-      <w:r>
-        <w:rPr>
-          <w:rFonts w:ascii="Arial" w:cs="Arial" w:eastAsia="Arial" w:hAnsi="Arial"/>
-        </w:rPr>
-        <w:t xml:space="preserve">, we will repair or replace the product or part at no cost to you, or arrange another remedy that you are entitled to by law.</w:t>
+        </w:rPr>
+        <w:t xml:space="preserve">products that have been </w:t>
+      </w:r>
+      <w:r>
+        <w:rPr>
+          <w:rFonts w:ascii="Arial" w:cs="Arial" w:eastAsia="Arial" w:hAnsi="Arial"/>
+          <w:b/>
+          <w:bCs/>
+        </w:rPr>
+        <w:t xml:space="preserve">bought second-hand</w:t>
+      </w:r>
+    </w:p>
+    <w:p>
+      <w:pPr>
+        <w:spacing w:after="160" w:line="300"/>
+      </w:pPr>
+      <w:r>
+        <w:rPr>
+          <w:rFonts w:ascii="Arial" w:cs="Arial" w:eastAsia="Arial" w:hAnsi="Arial"/>
+        </w:rPr>
+        <w:t xml:space="preserve">Nothing in this section limits your rights under the Australian Consumer Law.</w:t>
       </w:r>
     </w:p>
     <w:p>
@@ -733,7 +840,7 @@
           <w:sz w:val="26"/>
           <w:szCs w:val="26"/>
         </w:rPr>
-        <w:t xml:space="preserve">7. Costs of making a claim</w:t>
+        <w:t xml:space="preserve">7. Where and how to use our products</w:t>
       </w:r>
     </w:p>
     <w:p>
@@ -743,22 +850,23 @@
       <w:r>
         <w:rPr>
           <w:rFonts w:ascii="Arial" w:cs="Arial" w:eastAsia="Arial" w:hAnsi="Arial"/>
+        </w:rPr>
+        <w:t xml:space="preserve">Our products are made for </w:t>
+      </w:r>
+      <w:r>
+        <w:rPr>
+          <w:rFonts w:ascii="Arial" w:cs="Arial" w:eastAsia="Arial" w:hAnsi="Arial"/>
           <w:b/>
           <w:bCs/>
           <w:shd w:fill="FFF2B3" w:color="auto" w:val="clear"/>
         </w:rPr>
-        <w:t xml:space="preserve">[CONFIRM and edit - the law requires the warranty to say who pays for claim expenses.]</w:t>
-      </w:r>
-    </w:p>
-    <w:p>
-      <w:pPr>
-        <w:spacing w:after="160" w:line="300"/>
-      </w:pPr>
-      <w:r>
-        <w:rPr>
-          <w:rFonts w:ascii="Arial" w:cs="Arial" w:eastAsia="Arial" w:hAnsi="Arial"/>
-        </w:rPr>
-        <w:t xml:space="preserve">We will cover the reasonable cost of sending replacement parts or products to you within Victoria. If we ask you to return the product for inspection, we will </w:t>
+        <w:t xml:space="preserve">[dry, indoor, well-ventilated spaces such as garages, workshops, sheds and warehouses]</w:t>
+      </w:r>
+      <w:r>
+        <w:rPr>
+          <w:rFonts w:ascii="Arial" w:cs="Arial" w:eastAsia="Arial" w:hAnsi="Arial"/>
+        </w:rPr>
+        <w:t xml:space="preserve">. </w:t>
       </w:r>
       <w:r>
         <w:rPr>
@@ -767,13 +875,13 @@
           <w:bCs/>
           <w:shd w:fill="FFF2B3" w:color="auto" w:val="clear"/>
         </w:rPr>
-        <w:t xml:space="preserve">[cover / reimburse]</w:t>
-      </w:r>
-      <w:r>
-        <w:rPr>
-          <w:rFonts w:ascii="Arial" w:cs="Arial" w:eastAsia="Arial" w:hAnsi="Arial"/>
-        </w:rPr>
-        <w:t xml:space="preserve"> the reasonable cost of returning it.</w:t>
+        <w:t xml:space="preserve">[CONFIRM wording - you advertise sheds as a use, so decide how to describe the conditions the products suit, and whether outdoor or wet areas are excluded.]</w:t>
+      </w:r>
+      <w:r>
+        <w:rPr>
+          <w:rFonts w:ascii="Arial" w:cs="Arial" w:eastAsia="Arial" w:hAnsi="Arial"/>
+        </w:rPr>
+        <w:t xml:space="preserve"> Please keep products on a level, solid surface and away from standing water.</w:t>
       </w:r>
     </w:p>
     <w:p>
@@ -790,18 +898,123 @@
           <w:sz w:val="26"/>
           <w:szCs w:val="26"/>
         </w:rPr>
-        <w:t xml:space="preserve">8. Replacement parts and products</w:t>
-      </w:r>
-    </w:p>
-    <w:p>
-      <w:pPr>
-        <w:spacing w:after="160" w:line="300"/>
-      </w:pPr>
-      <w:r>
-        <w:rPr>
-          <w:rFonts w:ascii="Arial" w:cs="Arial" w:eastAsia="Arial" w:hAnsi="Arial"/>
-        </w:rPr>
-        <w:t xml:space="preserve">Where we replace a product or part under this warranty, the replacement is covered for the remainder of the original 12-month warranty period </w:t>
+        <w:t xml:space="preserve">8. How to make a claim</w:t>
+      </w:r>
+    </w:p>
+    <w:p>
+      <w:pPr>
+        <w:pStyle w:val="ListParagraph"/>
+        <w:numPr>
+          <w:ilvl w:val="0"/>
+          <w:numId w:val="3"/>
+        </w:numPr>
+        <w:spacing w:after="100" w:line="300"/>
+      </w:pPr>
+      <w:r>
+        <w:rPr>
+          <w:rFonts w:ascii="Arial" w:cs="Arial" w:eastAsia="Arial" w:hAnsi="Arial"/>
+          <w:b/>
+          <w:bCs/>
+        </w:rPr>
+        <w:t xml:space="preserve">Contact us</w:t>
+      </w:r>
+      <w:r>
+        <w:rPr>
+          <w:rFonts w:ascii="Arial" w:cs="Arial" w:eastAsia="Arial" w:hAnsi="Arial"/>
+        </w:rPr>
+        <w:t xml:space="preserve"> by email at Edwin_10@live.com.au, on +61 431 533 520, or through our Contact Us page. Please </w:t>
+      </w:r>
+      <w:r>
+        <w:rPr>
+          <w:rFonts w:ascii="Arial" w:cs="Arial" w:eastAsia="Arial" w:hAnsi="Arial"/>
+          <w:b/>
+          <w:bCs/>
+        </w:rPr>
+        <w:t xml:space="preserve">contact us before sending anything back</w:t>
+      </w:r>
+      <w:r>
+        <w:rPr>
+          <w:rFonts w:ascii="Arial" w:cs="Arial" w:eastAsia="Arial" w:hAnsi="Arial"/>
+        </w:rPr>
+        <w:t xml:space="preserve">.</w:t>
+      </w:r>
+    </w:p>
+    <w:p>
+      <w:pPr>
+        <w:pStyle w:val="ListParagraph"/>
+        <w:numPr>
+          <w:ilvl w:val="0"/>
+          <w:numId w:val="3"/>
+        </w:numPr>
+        <w:spacing w:after="100" w:line="300"/>
+      </w:pPr>
+      <w:r>
+        <w:rPr>
+          <w:rFonts w:ascii="Arial" w:cs="Arial" w:eastAsia="Arial" w:hAnsi="Arial"/>
+          <w:b/>
+          <w:bCs/>
+        </w:rPr>
+        <w:t xml:space="preserve">Give us proof of purchase</w:t>
+      </w:r>
+      <w:r>
+        <w:rPr>
+          <w:rFonts w:ascii="Arial" w:cs="Arial" w:eastAsia="Arial" w:hAnsi="Arial"/>
+        </w:rPr>
+        <w:t xml:space="preserve"> - your order confirmation or invoice - and a description of the problem. A bank or card statement on its own does not show what you bought.</w:t>
+      </w:r>
+    </w:p>
+    <w:p>
+      <w:pPr>
+        <w:pStyle w:val="ListParagraph"/>
+        <w:numPr>
+          <w:ilvl w:val="0"/>
+          <w:numId w:val="3"/>
+        </w:numPr>
+        <w:spacing w:after="100" w:line="300"/>
+      </w:pPr>
+      <w:r>
+        <w:rPr>
+          <w:rFonts w:ascii="Arial" w:cs="Arial" w:eastAsia="Arial" w:hAnsi="Arial"/>
+          <w:b/>
+          <w:bCs/>
+        </w:rPr>
+        <w:t xml:space="preserve">Send photos or a short video</w:t>
+      </w:r>
+      <w:r>
+        <w:rPr>
+          <w:rFonts w:ascii="Arial" w:cs="Arial" w:eastAsia="Arial" w:hAnsi="Arial"/>
+        </w:rPr>
+        <w:t xml:space="preserve"> that show the whole product and the problem.</w:t>
+      </w:r>
+    </w:p>
+    <w:p>
+      <w:pPr>
+        <w:pStyle w:val="ListParagraph"/>
+        <w:numPr>
+          <w:ilvl w:val="0"/>
+          <w:numId w:val="3"/>
+        </w:numPr>
+        <w:spacing w:after="100" w:line="300"/>
+      </w:pPr>
+      <w:r>
+        <w:rPr>
+          <w:rFonts w:ascii="Arial" w:cs="Arial" w:eastAsia="Arial" w:hAnsi="Arial"/>
+        </w:rPr>
+        <w:t xml:space="preserve">We will </w:t>
+      </w:r>
+      <w:r>
+        <w:rPr>
+          <w:rFonts w:ascii="Arial" w:cs="Arial" w:eastAsia="Arial" w:hAnsi="Arial"/>
+          <w:b/>
+          <w:bCs/>
+        </w:rPr>
+        <w:t xml:space="preserve">assess your claim</w:t>
+      </w:r>
+      <w:r>
+        <w:rPr>
+          <w:rFonts w:ascii="Arial" w:cs="Arial" w:eastAsia="Arial" w:hAnsi="Arial"/>
+        </w:rPr>
+        <w:t xml:space="preserve"> and reply within </w:t>
       </w:r>
       <w:r>
         <w:rPr>
@@ -810,13 +1023,101 @@
           <w:bCs/>
           <w:shd w:fill="FFF2B3" w:color="auto" w:val="clear"/>
         </w:rPr>
-        <w:t xml:space="preserve">[CONFIRM: or choose a fresh period]</w:t>
-      </w:r>
-      <w:r>
-        <w:rPr>
-          <w:rFonts w:ascii="Arial" w:cs="Arial" w:eastAsia="Arial" w:hAnsi="Arial"/>
-        </w:rPr>
-        <w:t xml:space="preserve">. We may replace a product with the same model or one of equivalent specification if the original is no longer available.</w:t>
+        <w:t xml:space="preserve">[X]</w:t>
+      </w:r>
+      <w:r>
+        <w:rPr>
+          <w:rFonts w:ascii="Arial" w:cs="Arial" w:eastAsia="Arial" w:hAnsi="Arial"/>
+          <w:b/>
+          <w:bCs/>
+        </w:rPr>
+        <w:t xml:space="preserve"> business days</w:t>
+      </w:r>
+      <w:r>
+        <w:rPr>
+          <w:rFonts w:ascii="Arial" w:cs="Arial" w:eastAsia="Arial" w:hAnsi="Arial"/>
+        </w:rPr>
+        <w:t xml:space="preserve">. We may ask for more information or arrange to inspect the product.</w:t>
+      </w:r>
+    </w:p>
+    <w:p>
+      <w:pPr>
+        <w:pStyle w:val="ListParagraph"/>
+        <w:numPr>
+          <w:ilvl w:val="0"/>
+          <w:numId w:val="3"/>
+        </w:numPr>
+        <w:spacing w:after="100" w:line="300"/>
+      </w:pPr>
+      <w:r>
+        <w:rPr>
+          <w:rFonts w:ascii="Arial" w:cs="Arial" w:eastAsia="Arial" w:hAnsi="Arial"/>
+        </w:rPr>
+        <w:t xml:space="preserve">If your claim is approved, we will tell you what we will do and how to arrange it:</w:t>
+      </w:r>
+    </w:p>
+    <w:p>
+      <w:pPr>
+        <w:pStyle w:val="ListParagraph"/>
+        <w:numPr>
+          <w:ilvl w:val="1"/>
+          <w:numId w:val="2"/>
+        </w:numPr>
+        <w:spacing w:after="80" w:line="300"/>
+      </w:pPr>
+      <w:r>
+        <w:rPr>
+          <w:rFonts w:ascii="Arial" w:cs="Arial" w:eastAsia="Arial" w:hAnsi="Arial"/>
+          <w:b/>
+          <w:bCs/>
+        </w:rPr>
+        <w:t xml:space="preserve">A single part:</w:t>
+      </w:r>
+      <w:r>
+        <w:rPr>
+          <w:rFonts w:ascii="Arial" w:cs="Arial" w:eastAsia="Arial" w:hAnsi="Arial"/>
+        </w:rPr>
+        <w:t xml:space="preserve"> we may simply post you a replacement part.</w:t>
+      </w:r>
+    </w:p>
+    <w:p>
+      <w:pPr>
+        <w:pStyle w:val="ListParagraph"/>
+        <w:numPr>
+          <w:ilvl w:val="1"/>
+          <w:numId w:val="2"/>
+        </w:numPr>
+        <w:spacing w:after="80" w:line="300"/>
+      </w:pPr>
+      <w:r>
+        <w:rPr>
+          <w:rFonts w:ascii="Arial" w:cs="Arial" w:eastAsia="Arial" w:hAnsi="Arial"/>
+          <w:b/>
+          <w:bCs/>
+        </w:rPr>
+        <w:t xml:space="preserve">The whole unit:</w:t>
+      </w:r>
+      <w:r>
+        <w:rPr>
+          <w:rFonts w:ascii="Arial" w:cs="Arial" w:eastAsia="Arial" w:hAnsi="Arial"/>
+        </w:rPr>
+        <w:t xml:space="preserve"> we will agree the details of the return with you.</w:t>
+      </w:r>
+    </w:p>
+    <w:p>
+      <w:pPr>
+        <w:pStyle w:val="ListParagraph"/>
+        <w:numPr>
+          <w:ilvl w:val="1"/>
+          <w:numId w:val="2"/>
+        </w:numPr>
+        <w:spacing w:after="80" w:line="300"/>
+      </w:pPr>
+      <w:r>
+        <w:rPr>
+          <w:rFonts w:ascii="Arial" w:cs="Arial" w:eastAsia="Arial" w:hAnsi="Arial"/>
+        </w:rPr>
+        <w:t xml:space="preserve">Please do not send products back yourself unless we ask you to.</w:t>
       </w:r>
     </w:p>
     <w:p>
@@ -833,7 +1134,7 @@
           <w:sz w:val="26"/>
           <w:szCs w:val="26"/>
         </w:rPr>
-        <w:t xml:space="preserve">9. Transfer of warranty</w:t>
+        <w:t xml:space="preserve">9. Costs of making a claim</w:t>
       </w:r>
     </w:p>
     <w:p>
@@ -844,7 +1145,7 @@
         <w:rPr>
           <w:rFonts w:ascii="Arial" w:cs="Arial" w:eastAsia="Arial" w:hAnsi="Arial"/>
         </w:rPr>
-        <w:t xml:space="preserve">This warranty is for the original purchaser </w:t>
+        <w:t xml:space="preserve">We will cover the reasonable freight cost of sending replacement parts or products to you within Victoria, and of arranging the return of a product that we have asked to have back. We may choose the carrier. </w:t>
       </w:r>
       <w:r>
         <w:rPr>
@@ -853,13 +1154,41 @@
           <w:bCs/>
           <w:shd w:fill="FFF2B3" w:color="auto" w:val="clear"/>
         </w:rPr>
-        <w:t xml:space="preserve">[CONFIRM: or "is transferable to a later owner with proof of the original purchase"]</w:t>
-      </w:r>
-      <w:r>
-        <w:rPr>
-          <w:rFonts w:ascii="Arial" w:cs="Arial" w:eastAsia="Arial" w:hAnsi="Arial"/>
-        </w:rPr>
-        <w:t xml:space="preserve">.</w:t>
+        <w:t xml:space="preserve">[CONFIRM.]</w:t>
+      </w:r>
+    </w:p>
+    <w:p>
+      <w:pPr>
+        <w:spacing w:after="160" w:line="300"/>
+      </w:pPr>
+      <w:r>
+        <w:rPr>
+          <w:rFonts w:ascii="Arial" w:cs="Arial" w:eastAsia="Arial" w:hAnsi="Arial"/>
+        </w:rPr>
+        <w:t xml:space="preserve">Where we inspect a product and find it is not covered by this warranty, we may ask you to cover reasonable inspection and return costs, </w:t>
+      </w:r>
+      <w:r>
+        <w:rPr>
+          <w:rFonts w:ascii="Arial" w:cs="Arial" w:eastAsia="Arial" w:hAnsi="Arial"/>
+          <w:b/>
+          <w:bCs/>
+        </w:rPr>
+        <w:t xml:space="preserve">to the extent the law allows</w:t>
+      </w:r>
+      <w:r>
+        <w:rPr>
+          <w:rFonts w:ascii="Arial" w:cs="Arial" w:eastAsia="Arial" w:hAnsi="Arial"/>
+        </w:rPr>
+        <w:t xml:space="preserve">. </w:t>
+      </w:r>
+      <w:r>
+        <w:rPr>
+          <w:rFonts w:ascii="Arial" w:cs="Arial" w:eastAsia="Arial" w:hAnsi="Arial"/>
+          <w:b/>
+          <w:bCs/>
+          <w:shd w:fill="FFF2B3" w:color="auto" w:val="clear"/>
+        </w:rPr>
+        <w:t xml:space="preserve">[CONFIRM.]</w:t>
       </w:r>
     </w:p>
     <w:p>
@@ -876,7 +1205,7 @@
           <w:sz w:val="26"/>
           <w:szCs w:val="26"/>
         </w:rPr>
-        <w:t xml:space="preserve">10. Contact us</w:t>
+        <w:t xml:space="preserve">10. Repair times</w:t>
       </w:r>
     </w:p>
     <w:p>
@@ -887,6 +1216,144 @@
         <w:rPr>
           <w:rFonts w:ascii="Arial" w:cs="Arial" w:eastAsia="Arial" w:hAnsi="Arial"/>
         </w:rPr>
+        <w:t xml:space="preserve">Where parts are available, we aim to complete approved repairs or send replacements within </w:t>
+      </w:r>
+      <w:r>
+        <w:rPr>
+          <w:rFonts w:ascii="Arial" w:cs="Arial" w:eastAsia="Arial" w:hAnsi="Arial"/>
+          <w:b/>
+          <w:bCs/>
+          <w:shd w:fill="FFF2B3" w:color="auto" w:val="clear"/>
+        </w:rPr>
+        <w:t xml:space="preserve">[10]</w:t>
+      </w:r>
+      <w:r>
+        <w:rPr>
+          <w:rFonts w:ascii="Arial" w:cs="Arial" w:eastAsia="Arial" w:hAnsi="Arial"/>
+          <w:b/>
+          <w:bCs/>
+        </w:rPr>
+        <w:t xml:space="preserve"> business days</w:t>
+      </w:r>
+      <w:r>
+        <w:rPr>
+          <w:rFonts w:ascii="Arial" w:cs="Arial" w:eastAsia="Arial" w:hAnsi="Arial"/>
+        </w:rPr>
+        <w:t xml:space="preserve"> of approving your claim. </w:t>
+      </w:r>
+      <w:r>
+        <w:rPr>
+          <w:rFonts w:ascii="Arial" w:cs="Arial" w:eastAsia="Arial" w:hAnsi="Arial"/>
+          <w:b/>
+          <w:bCs/>
+          <w:shd w:fill="FFF2B3" w:color="auto" w:val="clear"/>
+        </w:rPr>
+        <w:t xml:space="preserve">[CONFIRM.]</w:t>
+      </w:r>
+      <w:r>
+        <w:rPr>
+          <w:rFonts w:ascii="Arial" w:cs="Arial" w:eastAsia="Arial" w:hAnsi="Arial"/>
+        </w:rPr>
+        <w:t xml:space="preserve"> If a part is not available, we will let you know and discuss the options, which may include replacing the product with an equivalent one.</w:t>
+      </w:r>
+    </w:p>
+    <w:p>
+      <w:pPr>
+        <w:pStyle w:val="Heading2"/>
+        <w:keepNext/>
+        <w:spacing w:after="120" w:before="280"/>
+      </w:pPr>
+      <w:r>
+        <w:rPr>
+          <w:rFonts w:ascii="Arial" w:cs="Arial" w:eastAsia="Arial" w:hAnsi="Arial"/>
+          <w:b/>
+          <w:bCs/>
+          <w:sz w:val="26"/>
+          <w:szCs w:val="26"/>
+        </w:rPr>
+        <w:t xml:space="preserve">11. Who the warranty applies to, and limits</w:t>
+      </w:r>
+    </w:p>
+    <w:p>
+      <w:pPr>
+        <w:pStyle w:val="ListParagraph"/>
+        <w:numPr>
+          <w:ilvl w:val="0"/>
+          <w:numId w:val="2"/>
+        </w:numPr>
+        <w:spacing w:after="100" w:line="300"/>
+      </w:pPr>
+      <w:r>
+        <w:rPr>
+          <w:rFonts w:ascii="Arial" w:cs="Arial" w:eastAsia="Arial" w:hAnsi="Arial"/>
+        </w:rPr>
+        <w:t xml:space="preserve">This warranty is for the </w:t>
+      </w:r>
+      <w:r>
+        <w:rPr>
+          <w:rFonts w:ascii="Arial" w:cs="Arial" w:eastAsia="Arial" w:hAnsi="Arial"/>
+          <w:b/>
+          <w:bCs/>
+        </w:rPr>
+        <w:t xml:space="preserve">original purchaser</w:t>
+      </w:r>
+      <w:r>
+        <w:rPr>
+          <w:rFonts w:ascii="Arial" w:cs="Arial" w:eastAsia="Arial" w:hAnsi="Arial"/>
+        </w:rPr>
+        <w:t xml:space="preserve">. </w:t>
+      </w:r>
+      <w:r>
+        <w:rPr>
+          <w:rFonts w:ascii="Arial" w:cs="Arial" w:eastAsia="Arial" w:hAnsi="Arial"/>
+          <w:b/>
+          <w:bCs/>
+          <w:shd w:fill="FFF2B3" w:color="auto" w:val="clear"/>
+        </w:rPr>
+        <w:t xml:space="preserve">[CONFIRM: or "can be passed to a later owner with the original proof of purchase".]</w:t>
+      </w:r>
+    </w:p>
+    <w:p>
+      <w:pPr>
+        <w:pStyle w:val="ListParagraph"/>
+        <w:numPr>
+          <w:ilvl w:val="0"/>
+          <w:numId w:val="2"/>
+        </w:numPr>
+        <w:spacing w:after="100" w:line="300"/>
+      </w:pPr>
+      <w:r>
+        <w:rPr>
+          <w:rFonts w:ascii="Arial" w:cs="Arial" w:eastAsia="Arial" w:hAnsi="Arial"/>
+        </w:rPr>
+        <w:t xml:space="preserve">To the extent the law allows, our liability under this warranty is limited to repairing the product, replacing it, or refunding it, as set out above. We are not liable for indirect or consequential loss, such as lost profits, except where the law entitles you to compensation for reasonably foreseeable loss.</w:t>
+      </w:r>
+    </w:p>
+    <w:p>
+      <w:pPr>
+        <w:pStyle w:val="Heading2"/>
+        <w:keepNext/>
+        <w:spacing w:after="120" w:before="280"/>
+      </w:pPr>
+      <w:r>
+        <w:rPr>
+          <w:rFonts w:ascii="Arial" w:cs="Arial" w:eastAsia="Arial" w:hAnsi="Arial"/>
+          <w:b/>
+          <w:bCs/>
+          <w:sz w:val="26"/>
+          <w:szCs w:val="26"/>
+        </w:rPr>
+        <w:t xml:space="preserve">12. Contact us</w:t>
+      </w:r>
+    </w:p>
+    <w:p>
+      <w:pPr>
+        <w:spacing w:after="160" w:line="300"/>
+      </w:pPr>
+      <w:r>
+        <w:rPr>
+          <w:rFonts w:ascii="Arial" w:cs="Arial" w:eastAsia="Arial" w:hAnsi="Arial"/>
+        </w:rPr>
         <w:t xml:space="preserve">Super Shelving</w:t>
       </w:r>
       <w:r>
@@ -923,14 +1390,7 @@
         <w:rPr>
           <w:rFonts w:ascii="Arial" w:cs="Arial" w:eastAsia="Arial" w:hAnsi="Arial"/>
         </w:rPr>
-        <w:t xml:space="preserve">Email: </w:t>
-      </w:r>
-      <w:r>
-        <w:rPr>
-          <w:rFonts w:ascii="Arial" w:cs="Arial" w:eastAsia="Arial" w:hAnsi="Arial"/>
-          <w:shd w:fill="FFF2B3" w:color="auto" w:val="clear"/>
-        </w:rPr>
-        <w:t xml:space="preserve">[BUSINESS EMAIL]</w:t>
+        <w:t xml:space="preserve">Email: Edwin_10@live.com.au</w:t>
       </w:r>
     </w:p>
     <w:sectPr>
@@ -1144,6 +1604,15 @@
       <w:lvlJc w:val="left"/>
       <w:pPr>
         <w:ind w:left="720" w:hanging="360"/>
+      </w:pPr>
+    </w:lvl>
+    <w:lvl w:ilvl="1" w:tentative="1">
+      <w:start w:val="1"/>
+      <w:numFmt w:val="bullet"/>
+      <w:lvlText w:val="–"/>
+      <w:lvlJc w:val="left"/>
+      <w:pPr>
+        <w:ind w:left="1260" w:hanging="360"/>
       </w:pPr>
     </w:lvl>
   </w:abstractNum>

</xml_diff>

<commit_message>
Warranty policy v3: purchase-date start, dry indoor use, reply times, original purchaser only
Co-Authored-By: Claude Sonnet 5.5 <noreply@anthropic.com>
</commit_message>
<xml_diff>
--- a/docs/policy-drafts/warranty-policy.docx
+++ b/docs/policy-drafts/warranty-policy.docx
@@ -35,7 +35,7 @@
           <w:sz w:val="20"/>
           <w:szCs w:val="20"/>
         </w:rPr>
-        <w:t xml:space="preserve">Draft for review (version 2).</w:t>
+        <w:t xml:space="preserve">Draft for review (version 3).</w:t>
       </w:r>
       <w:r>
         <w:rPr>
@@ -295,21 +295,6 @@
         <w:rPr>
           <w:rFonts w:ascii="Arial" w:cs="Arial" w:eastAsia="Arial" w:hAnsi="Arial"/>
         </w:rPr>
-        <w:t xml:space="preserve"> </w:t>
-      </w:r>
-      <w:r>
-        <w:rPr>
-          <w:rFonts w:ascii="Arial" w:cs="Arial" w:eastAsia="Arial" w:hAnsi="Arial"/>
-          <w:b/>
-          <w:bCs/>
-          <w:shd w:fill="FFF2B3" w:color="auto" w:val="clear"/>
-        </w:rPr>
-        <w:t xml:space="preserve">[CONFIRM: or from the date you receive or collect the order]</w:t>
-      </w:r>
-      <w:r>
-        <w:rPr>
-          <w:rFonts w:ascii="Arial" w:cs="Arial" w:eastAsia="Arial" w:hAnsi="Arial"/>
-        </w:rPr>
         <w:t xml:space="preserve">. This is on top of the consumer guarantees described in section 1, which are not limited to 12 months.</w:t>
       </w:r>
     </w:p>
@@ -858,30 +843,14 @@
           <w:rFonts w:ascii="Arial" w:cs="Arial" w:eastAsia="Arial" w:hAnsi="Arial"/>
           <w:b/>
           <w:bCs/>
-          <w:shd w:fill="FFF2B3" w:color="auto" w:val="clear"/>
-        </w:rPr>
-        <w:t xml:space="preserve">[dry, indoor, well-ventilated spaces such as garages, workshops, sheds and warehouses]</w:t>
-      </w:r>
-      <w:r>
-        <w:rPr>
-          <w:rFonts w:ascii="Arial" w:cs="Arial" w:eastAsia="Arial" w:hAnsi="Arial"/>
-        </w:rPr>
-        <w:t xml:space="preserve">. </w:t>
-      </w:r>
-      <w:r>
-        <w:rPr>
-          <w:rFonts w:ascii="Arial" w:cs="Arial" w:eastAsia="Arial" w:hAnsi="Arial"/>
-          <w:b/>
-          <w:bCs/>
-          <w:shd w:fill="FFF2B3" w:color="auto" w:val="clear"/>
-        </w:rPr>
-        <w:t xml:space="preserve">[CONFIRM wording - you advertise sheds as a use, so decide how to describe the conditions the products suit, and whether outdoor or wet areas are excluded.]</w:t>
-      </w:r>
-      <w:r>
-        <w:rPr>
-          <w:rFonts w:ascii="Arial" w:cs="Arial" w:eastAsia="Arial" w:hAnsi="Arial"/>
-        </w:rPr>
-        <w:t xml:space="preserve"> Please keep products on a level, solid surface and away from standing water.</w:t>
+        </w:rPr>
+        <w:t xml:space="preserve">dry, indoor use</w:t>
+      </w:r>
+      <w:r>
+        <w:rPr>
+          <w:rFonts w:ascii="Arial" w:cs="Arial" w:eastAsia="Arial" w:hAnsi="Arial"/>
+        </w:rPr>
+        <w:t xml:space="preserve"> - for example in garages, workshops, sheds and warehouses. They are not designed for outdoor use or for places exposed to rain, standing water, salt air or constant damp. Please keep products on a level, solid surface and away from standing water.</w:t>
       </w:r>
     </w:p>
     <w:p>
@@ -1008,13 +977,27 @@
           <w:b/>
           <w:bCs/>
         </w:rPr>
-        <w:t xml:space="preserve">assess your claim</w:t>
-      </w:r>
-      <w:r>
-        <w:rPr>
-          <w:rFonts w:ascii="Arial" w:cs="Arial" w:eastAsia="Arial" w:hAnsi="Arial"/>
-        </w:rPr>
-        <w:t xml:space="preserve"> and reply within </w:t>
+        <w:t xml:space="preserve">reply within 2 business days</w:t>
+      </w:r>
+      <w:r>
+        <w:rPr>
+          <w:rFonts w:ascii="Arial" w:cs="Arial" w:eastAsia="Arial" w:hAnsi="Arial"/>
+        </w:rPr>
+        <w:t xml:space="preserve"> and aim to </w:t>
+      </w:r>
+      <w:r>
+        <w:rPr>
+          <w:rFonts w:ascii="Arial" w:cs="Arial" w:eastAsia="Arial" w:hAnsi="Arial"/>
+          <w:b/>
+          <w:bCs/>
+        </w:rPr>
+        <w:t xml:space="preserve">decide your claim within 5 business days</w:t>
+      </w:r>
+      <w:r>
+        <w:rPr>
+          <w:rFonts w:ascii="Arial" w:cs="Arial" w:eastAsia="Arial" w:hAnsi="Arial"/>
+        </w:rPr>
+        <w:t xml:space="preserve"> of receiving your proof of purchase and photos </w:t>
       </w:r>
       <w:r>
         <w:rPr>
@@ -1023,15 +1006,7 @@
           <w:bCs/>
           <w:shd w:fill="FFF2B3" w:color="auto" w:val="clear"/>
         </w:rPr>
-        <w:t xml:space="preserve">[X]</w:t>
-      </w:r>
-      <w:r>
-        <w:rPr>
-          <w:rFonts w:ascii="Arial" w:cs="Arial" w:eastAsia="Arial" w:hAnsi="Arial"/>
-          <w:b/>
-          <w:bCs/>
-        </w:rPr>
-        <w:t xml:space="preserve"> business days</w:t>
+        <w:t xml:space="preserve">[CONFIRM]</w:t>
       </w:r>
       <w:r>
         <w:rPr>
@@ -1145,16 +1120,7 @@
         <w:rPr>
           <w:rFonts w:ascii="Arial" w:cs="Arial" w:eastAsia="Arial" w:hAnsi="Arial"/>
         </w:rPr>
-        <w:t xml:space="preserve">We will cover the reasonable freight cost of sending replacement parts or products to you within Victoria, and of arranging the return of a product that we have asked to have back. We may choose the carrier. </w:t>
-      </w:r>
-      <w:r>
-        <w:rPr>
-          <w:rFonts w:ascii="Arial" w:cs="Arial" w:eastAsia="Arial" w:hAnsi="Arial"/>
-          <w:b/>
-          <w:bCs/>
-          <w:shd w:fill="FFF2B3" w:color="auto" w:val="clear"/>
-        </w:rPr>
-        <w:t xml:space="preserve">[CONFIRM.]</w:t>
+        <w:t xml:space="preserve">We will cover the reasonable freight cost of sending replacement parts or products to you within Victoria, and of arranging the return of a product that we have asked to have back. We may choose the carrier.</w:t>
       </w:r>
     </w:p>
     <w:p>
@@ -1179,16 +1145,7 @@
         <w:rPr>
           <w:rFonts w:ascii="Arial" w:cs="Arial" w:eastAsia="Arial" w:hAnsi="Arial"/>
         </w:rPr>
-        <w:t xml:space="preserve">. </w:t>
-      </w:r>
-      <w:r>
-        <w:rPr>
-          <w:rFonts w:ascii="Arial" w:cs="Arial" w:eastAsia="Arial" w:hAnsi="Arial"/>
-          <w:b/>
-          <w:bCs/>
-          <w:shd w:fill="FFF2B3" w:color="auto" w:val="clear"/>
-        </w:rPr>
-        <w:t xml:space="preserve">[CONFIRM.]</w:t>
+        <w:t xml:space="preserve">.</w:t>
       </w:r>
     </w:p>
     <w:p>
@@ -1301,16 +1258,7 @@
         <w:rPr>
           <w:rFonts w:ascii="Arial" w:cs="Arial" w:eastAsia="Arial" w:hAnsi="Arial"/>
         </w:rPr>
-        <w:t xml:space="preserve">. </w:t>
-      </w:r>
-      <w:r>
-        <w:rPr>
-          <w:rFonts w:ascii="Arial" w:cs="Arial" w:eastAsia="Arial" w:hAnsi="Arial"/>
-          <w:b/>
-          <w:bCs/>
-          <w:shd w:fill="FFF2B3" w:color="auto" w:val="clear"/>
-        </w:rPr>
-        <w:t xml:space="preserve">[CONFIRM: or "can be passed to a later owner with the original proof of purchase".]</w:t>
+        <w:t xml:space="preserve"> only. It does not pass to anyone else if the product is sold on or given away.</w:t>
       </w:r>
     </w:p>
     <w:p>

</xml_diff>

<commit_message>
Warranty extended to 2 years, rust excluded, no claim reply time; Returns v7 and Terms v6 updated to match
Co-Authored-By: Claude Sonnet 5.5 <noreply@anthropic.com>
</commit_message>
<xml_diff>
--- a/docs/policy-drafts/warranty-policy.docx
+++ b/docs/policy-drafts/warranty-policy.docx
@@ -35,7 +35,7 @@
           <w:sz w:val="20"/>
           <w:szCs w:val="20"/>
         </w:rPr>
-        <w:t xml:space="preserve">Draft for review (version 3).</w:t>
+        <w:t xml:space="preserve">Draft for review (version 4).</w:t>
       </w:r>
       <w:r>
         <w:rPr>
@@ -275,7 +275,7 @@
           <w:b/>
           <w:bCs/>
         </w:rPr>
-        <w:t xml:space="preserve">12 months</w:t>
+        <w:t xml:space="preserve">2 years</w:t>
       </w:r>
       <w:r>
         <w:rPr>
@@ -295,7 +295,7 @@
         <w:rPr>
           <w:rFonts w:ascii="Arial" w:cs="Arial" w:eastAsia="Arial" w:hAnsi="Arial"/>
         </w:rPr>
-        <w:t xml:space="preserve">. This is on top of the consumer guarantees described in section 1, which are not limited to 12 months.</w:t>
+        <w:t xml:space="preserve">. This is on top of the consumer guarantees described in section 1, which are not limited to 2 years.</w:t>
       </w:r>
     </w:p>
     <w:p>
@@ -423,7 +423,7 @@
         <w:rPr>
           <w:rFonts w:ascii="Arial" w:cs="Arial" w:eastAsia="Arial" w:hAnsi="Arial"/>
         </w:rPr>
-        <w:t xml:space="preserve">If we replace a product or part, the replacement is covered for the rest of the original 12-month period </w:t>
+        <w:t xml:space="preserve">If we replace a product or part, the replacement is covered for the rest of the original 2-year period </w:t>
       </w:r>
       <w:r>
         <w:rPr>
@@ -698,22 +698,13 @@
           <w:b/>
           <w:bCs/>
         </w:rPr>
-        <w:t xml:space="preserve">surface rust</w:t>
-      </w:r>
-      <w:r>
-        <w:rPr>
-          <w:rFonts w:ascii="Arial" w:cs="Arial" w:eastAsia="Arial" w:hAnsi="Arial"/>
-        </w:rPr>
-        <w:t xml:space="preserve"> or marks from damp, humid, salty or otherwise corrosive conditions </w:t>
-      </w:r>
-      <w:r>
-        <w:rPr>
-          <w:rFonts w:ascii="Arial" w:cs="Arial" w:eastAsia="Arial" w:hAnsi="Arial"/>
-          <w:b/>
-          <w:bCs/>
-          <w:shd w:fill="FFF2B3" w:color="auto" w:val="clear"/>
-        </w:rPr>
-        <w:t xml:space="preserve">[CONFIRM: and whether structural rust that makes the product unsafe is still covered unless caused by neglect]</w:t>
+        <w:t xml:space="preserve">rust, corrosion or deterioration of the finish</w:t>
+      </w:r>
+      <w:r>
+        <w:rPr>
+          <w:rFonts w:ascii="Arial" w:cs="Arial" w:eastAsia="Arial" w:hAnsi="Arial"/>
+        </w:rPr>
+        <w:t xml:space="preserve"> caused by moisture, humidity, salt air, poor storage, or use in damp or corrosive conditions</w:t>
       </w:r>
     </w:p>
     <w:p>
@@ -977,36 +968,7 @@
           <w:b/>
           <w:bCs/>
         </w:rPr>
-        <w:t xml:space="preserve">reply within 2 business days</w:t>
-      </w:r>
-      <w:r>
-        <w:rPr>
-          <w:rFonts w:ascii="Arial" w:cs="Arial" w:eastAsia="Arial" w:hAnsi="Arial"/>
-        </w:rPr>
-        <w:t xml:space="preserve"> and aim to </w:t>
-      </w:r>
-      <w:r>
-        <w:rPr>
-          <w:rFonts w:ascii="Arial" w:cs="Arial" w:eastAsia="Arial" w:hAnsi="Arial"/>
-          <w:b/>
-          <w:bCs/>
-        </w:rPr>
-        <w:t xml:space="preserve">decide your claim within 5 business days</w:t>
-      </w:r>
-      <w:r>
-        <w:rPr>
-          <w:rFonts w:ascii="Arial" w:cs="Arial" w:eastAsia="Arial" w:hAnsi="Arial"/>
-        </w:rPr>
-        <w:t xml:space="preserve"> of receiving your proof of purchase and photos </w:t>
-      </w:r>
-      <w:r>
-        <w:rPr>
-          <w:rFonts w:ascii="Arial" w:cs="Arial" w:eastAsia="Arial" w:hAnsi="Arial"/>
-          <w:b/>
-          <w:bCs/>
-          <w:shd w:fill="FFF2B3" w:color="auto" w:val="clear"/>
-        </w:rPr>
-        <w:t xml:space="preserve">[CONFIRM]</w:t>
+        <w:t xml:space="preserve">assess your claim</w:t>
       </w:r>
       <w:r>
         <w:rPr>
@@ -1162,7 +1124,7 @@
           <w:sz w:val="26"/>
           <w:szCs w:val="26"/>
         </w:rPr>
-        <w:t xml:space="preserve">10. Repair times</w:t>
+        <w:t xml:space="preserve">10. Repairs and replacements</w:t>
       </w:r>
     </w:p>
     <w:p>
@@ -1173,45 +1135,7 @@
         <w:rPr>
           <w:rFonts w:ascii="Arial" w:cs="Arial" w:eastAsia="Arial" w:hAnsi="Arial"/>
         </w:rPr>
-        <w:t xml:space="preserve">Where parts are available, we aim to complete approved repairs or send replacements within </w:t>
-      </w:r>
-      <w:r>
-        <w:rPr>
-          <w:rFonts w:ascii="Arial" w:cs="Arial" w:eastAsia="Arial" w:hAnsi="Arial"/>
-          <w:b/>
-          <w:bCs/>
-          <w:shd w:fill="FFF2B3" w:color="auto" w:val="clear"/>
-        </w:rPr>
-        <w:t xml:space="preserve">[10]</w:t>
-      </w:r>
-      <w:r>
-        <w:rPr>
-          <w:rFonts w:ascii="Arial" w:cs="Arial" w:eastAsia="Arial" w:hAnsi="Arial"/>
-          <w:b/>
-          <w:bCs/>
-        </w:rPr>
-        <w:t xml:space="preserve"> business days</w:t>
-      </w:r>
-      <w:r>
-        <w:rPr>
-          <w:rFonts w:ascii="Arial" w:cs="Arial" w:eastAsia="Arial" w:hAnsi="Arial"/>
-        </w:rPr>
-        <w:t xml:space="preserve"> of approving your claim. </w:t>
-      </w:r>
-      <w:r>
-        <w:rPr>
-          <w:rFonts w:ascii="Arial" w:cs="Arial" w:eastAsia="Arial" w:hAnsi="Arial"/>
-          <w:b/>
-          <w:bCs/>
-          <w:shd w:fill="FFF2B3" w:color="auto" w:val="clear"/>
-        </w:rPr>
-        <w:t xml:space="preserve">[CONFIRM.]</w:t>
-      </w:r>
-      <w:r>
-        <w:rPr>
-          <w:rFonts w:ascii="Arial" w:cs="Arial" w:eastAsia="Arial" w:hAnsi="Arial"/>
-        </w:rPr>
-        <w:t xml:space="preserve"> If a part is not available, we will let you know and discuss the options, which may include replacing the product with an equivalent one.</w:t>
+        <w:t xml:space="preserve">How long a repair or replacement takes depends on whether we have the parts available. When we approve your claim, we will tell you what to expect. If a part is not available, we will let you know and discuss the options, which may include replacing the product with an equivalent one.</w:t>
       </w:r>
     </w:p>
     <w:p>

</xml_diff>